<commit_message>
Fix three factual inconsistencies in self-reflection docx
Agent-Logs-Url: https://github.com/Anaxagorius/S.I.R.E./sessions/96dc3f7c-cbda-4771-9fe5-a5dc48614d8e

Co-authored-by: Anaxagorius <188515693+Anaxagorius@users.noreply.github.com>
</commit_message>
<xml_diff>
--- a/SIRE_FinalSelfReflection_TomBurchell.docx
+++ b/SIRE_FinalSelfReflection_TomBurchell.docx
@@ -159,7 +159,7 @@
           <w:i w:val="0"/>
           <w:sz w:val="22"/>
         </w:rPr>
-        <w:t>I designed and implemented the Socket.IO real-time layer under the /sim namespace, defining the complete event protocol: session lifecycle events (session:created, session:joined, session:ended), live roster updates (roster:update), escalation ticks (timeline:tick), instructor event injections (event:inject), and trainee decision broadcasts (trainee:decision). I applied idempotent event handling throughout so that re-delivered messages could not corrupt session state, and used Socket.IO rooms to guarantee full isolation between concurrent sessions.</w:t>
+        <w:t>I designed and implemented the Socket.IO real-time layer under the /sim namespace, defining the complete event protocol: session lifecycle events (session:join, session:joined, session:end), escalation ticks (timeline:tick), instructor injections (admin:inject), and trainee action broadcasts (event:log / event:log:broadcast). Roster state is delivered as part of the session:joined payload rather than as a separate event, keeping join confirmation and roster synchronisation atomic. I used Socket.IO rooms to guarantee full isolation between concurrent sessions.</w:t>
       </w:r>
     </w:p>
     <w:p>
@@ -173,7 +173,7 @@
           <w:i w:val="0"/>
           <w:sz w:val="22"/>
         </w:rPr>
-        <w:t>I built the scenario escalation engine—a timer-driven state machine that reads each scenario's JSON definition and automatically advances through escalation phases at the correct intervals, broadcasting timeline ticks to all connected participants without requiring instructor interaction. The engine was designed to be stateless per tick, making pause, resume, and replay straightforward and free of accumulated side effects.</w:t>
+        <w:t>I built the scenario escalation engine—a timer-driven state machine that reads each scenario's JSON definition and automatically advances through escalation phases at the correct intervals, broadcasting timeline:tick events to all connected participants without requiring instructor interaction. The engine exposes start and stop controls and was designed to be stateless per tick, avoiding accumulated side effects across the escalation sequence.</w:t>
       </w:r>
     </w:p>
     <w:p>
@@ -187,7 +187,7 @@
           <w:i w:val="0"/>
           <w:sz w:val="22"/>
         </w:rPr>
-        <w:t>Finally, I owned the entire cloud deployment pipeline. I authored the render.yaml Blueprint that provisions both the backend Node service and the frontend static site in a single operation, used fromService references to automatically wire VITE_API_BASE and ALLOWED_ORIGINS between the two services, and wrote the Deployment Guide and Cloud Deployment Quickstart so that the environment could be reproduced reliably by anyone on the team or any future maintainer.</w:t>
+        <w:t>Finally, I owned the entire cloud deployment pipeline. I authored the render.yaml Blueprint that provisions both the backend Node service and the frontend static site in a single operation. VITE_API_BASE is wired automatically via a fromService reference to the backend service URL, while ALLOWED_ORIGINS on the backend is set to the known frontend origin. I also wrote the Deployment Guide and Cloud Deployment Quickstart so that the environment could be reproduced reliably by anyone on the team or any future maintainer.</w:t>
       </w:r>
     </w:p>
     <w:p>

</xml_diff>